<commit_message>
Fixed missing currency on import and removed PO delivery date requirement
</commit_message>
<xml_diff>
--- a/templates/po_template_clean.docx
+++ b/templates/po_template_clean.docx
@@ -4576,8 +4576,8 @@
       <w:gridCol w:w="1565"/>
       <w:gridCol w:w="3301"/>
       <w:gridCol w:w="1338"/>
-      <w:gridCol w:w="2544"/>
-      <w:gridCol w:w="1425"/>
+      <w:gridCol w:w="1844"/>
+      <w:gridCol w:w="2125"/>
       <w:gridCol w:w="2715"/>
     </w:tblGrid>
     <w:tr>
@@ -4679,7 +4679,7 @@
       </w:tc>
       <w:tc>
         <w:tcPr>
-          <w:tcW w:w="2544" w:type="dxa"/>
+          <w:tcW w:w="1844" w:type="dxa"/>
           <w:vAlign w:val="center"/>
         </w:tcPr>
         <w:p>
@@ -4718,7 +4718,7 @@
       </w:tc>
       <w:tc>
         <w:tcPr>
-          <w:tcW w:w="1425" w:type="dxa"/>
+          <w:tcW w:w="2125" w:type="dxa"/>
           <w:vAlign w:val="center"/>
         </w:tcPr>
         <w:p>
@@ -4850,7 +4850,7 @@
       </w:tc>
       <w:tc>
         <w:tcPr>
-          <w:tcW w:w="3969" w:type="dxa"/>
+          <w:tcW w:w="3269" w:type="dxa"/>
           <w:gridSpan w:val="2"/>
           <w:vAlign w:val="center"/>
         </w:tcPr>
@@ -4873,7 +4873,7 @@
       </w:tc>
       <w:tc>
         <w:tcPr>
-          <w:tcW w:w="2715" w:type="dxa"/>
+          <w:tcW w:w="3415" w:type="dxa"/>
         </w:tcPr>
         <w:p>
           <w:pPr>
@@ -5014,7 +5014,7 @@
       </w:tc>
       <w:tc>
         <w:tcPr>
-          <w:tcW w:w="3969" w:type="dxa"/>
+          <w:tcW w:w="3269" w:type="dxa"/>
           <w:gridSpan w:val="2"/>
           <w:vAlign w:val="center"/>
         </w:tcPr>
@@ -5051,7 +5051,7 @@
       </w:tc>
       <w:tc>
         <w:tcPr>
-          <w:tcW w:w="2715" w:type="dxa"/>
+          <w:tcW w:w="3415" w:type="dxa"/>
         </w:tcPr>
         <w:p>
           <w:pPr>

</xml_diff>